<commit_message>
Site updated: 2024-05-23 22:59:51
</commit_message>
<xml_diff>
--- a/treasure/download/杂藏-139部/史传部-96部/新建文件夹/集神州三宝感通录-唐-道宣.docx
+++ b/treasure/download/杂藏-139部/史传部-96部/新建文件夹/集神州三宝感通录-唐-道宣.docx
@@ -11,7 +11,6 @@
           <w:shd w:val="pct15" w:color="auto" w:fill="FFFFFF"/>
         </w:rPr>
       </w:pPr>
-      <w:bookmarkStart w:id="0" w:name="_GoBack"/>
       <w:r>
         <w:rPr>
           <w:rFonts w:ascii="楷体" w:eastAsia="楷体" w:hAnsi="楷体" w:hint="eastAsia"/>
@@ -22,7 +21,6 @@
         <w:t>集神州三宝感通录</w:t>
       </w:r>
     </w:p>
-    <w:bookmarkEnd w:id="0"/>
     <w:p>
       <w:pPr>
         <w:ind w:firstLineChars="200" w:firstLine="480"/>
@@ -8352,7 +8350,45 @@
           <w:szCs w:val="24"/>
           <w:shd w:val="pct15" w:color="auto" w:fill="FFFFFF"/>
         </w:rPr>
-        <w:t>高齐文宣在晋阳。使人骑白骆驼。向我寺取经函去。使问。不知何寺。帝曰。但任驼行。自知寺处。日晚出城。驼行至急。奄然如睡。忽至一山名为冥寂。山半有寺。群沙弥曰。高洋馲驼来也。便引入寺。见一老僧。拜已问曰。高洋作天子何似。答曰圣明。问曰尔来何为。曰令取经函。僧曰洋在寺懒读经。今北行东头是其房。可取函与之。即乘驼而返。如睡如梦。奄至晋阳。以函返命。不久帝行至谷口木井寺。有舍身痴人不解语。忽语帝曰。我先去。尔后可来。帝然之。是夜痴人死。不久帝于晋阳不豫。使刘桃枝负行。鼻血淋沥。是夜帝崩。</w:t>
+        <w:t>高齐文宣</w:t>
+      </w:r>
+      <w:r>
+        <w:rPr>
+          <w:rFonts w:ascii="楷体" w:eastAsia="楷体" w:hAnsi="楷体" w:hint="eastAsia"/>
+          <w:sz w:val="24"/>
+          <w:szCs w:val="24"/>
+          <w:shd w:val="pct15" w:color="auto" w:fill="FFFFFF"/>
+        </w:rPr>
+        <w:t>(</w:t>
+      </w:r>
+      <w:r>
+        <w:rPr>
+          <w:rFonts w:ascii="楷体" w:eastAsia="楷体" w:hAnsi="楷体" w:hint="eastAsia"/>
+          <w:sz w:val="24"/>
+          <w:szCs w:val="24"/>
+          <w:shd w:val="pct15" w:color="auto" w:fill="FFFFFF"/>
+        </w:rPr>
+        <w:t>高洋</w:t>
+      </w:r>
+      <w:bookmarkStart w:id="0" w:name="_GoBack"/>
+      <w:bookmarkEnd w:id="0"/>
+      <w:r>
+        <w:rPr>
+          <w:rFonts w:ascii="楷体" w:eastAsia="楷体" w:hAnsi="楷体"/>
+          <w:sz w:val="24"/>
+          <w:szCs w:val="24"/>
+          <w:shd w:val="pct15" w:color="auto" w:fill="FFFFFF"/>
+        </w:rPr>
+        <w:t>)</w:t>
+      </w:r>
+      <w:r>
+        <w:rPr>
+          <w:rFonts w:ascii="楷体" w:eastAsia="楷体" w:hAnsi="楷体" w:hint="eastAsia"/>
+          <w:sz w:val="24"/>
+          <w:szCs w:val="24"/>
+          <w:shd w:val="pct15" w:color="auto" w:fill="FFFFFF"/>
+        </w:rPr>
+        <w:t>在晋阳。使人骑白骆驼。向我寺取经函去。使问。不知何寺。帝曰。但任驼行。自知寺处。日晚出城。驼行至急。奄然如睡。忽至一山名为冥寂。山半有寺。群沙弥曰。高洋馲驼来也。便引入寺。见一老僧。拜已问曰。高洋作天子何似。答曰圣明。问曰尔来何为。曰令取经函。僧曰洋在寺懒读经。今北行东头是其房。可取函与之。即乘驼而返。如睡如梦。奄至晋阳。以函返命。不久帝行至谷口木井寺。有舍身痴人不解语。忽语帝曰。我先去。尔后可来。帝然之。是夜痴人死。不久帝于晋阳不豫。使刘桃枝负行。鼻血淋沥。是夜帝崩。</w:t>
       </w:r>
     </w:p>
     <w:p>

</xml_diff>